<commit_message>
Refine IRB attachments HTML: Mayo mark, elegant headings, PI-only contact
- Add the Mayo Clinic mark (three-shield SVG and serif wordmark, reused from the
  reviewer questionnaire for consistency) to the cover, paired with the
  confidential marker on a brand bar.
- Replace the vertical rules beside section headings with serif navy headings
  over a fine hairline rule, which reads more cleanly in a formal document.
- Participant-facing contact is now the principal investigator only: the
  board-contact lines and their placeholder are removed from the information
  sheet (Attachment A) and the survey closing screen (Attachment C).
- Update the preparation notes to match, and record the PI-only contact decision.
- Drop the superseded standalone Word attachments and PDF renders; the
  consolidated HTML document is the deliverable.
</commit_message>
<xml_diff>
--- a/IRB/Preparation_Notes_and_Decisions.docx
+++ b/IRB/Preparation_Notes_and_Decisions.docx
@@ -73,7 +73,7 @@
           <w:color w:val="212A33"/>
           <w:sz w:val="21"/>
         </w:rPr>
-        <w:t>This note accompanies the seven standalone attachment documents (A–G) prepared for submission. It records the editorial corrections applied to those standalone files, the design decisions made, and the one item still requiring the study team. The two author-provided originals (the IRB application and the combined supporting-documents file) were left unchanged; the corrections below are reflected only in the standalone attachments.</w:t>
+        <w:t>This note accompanies the consolidated submission document containing Attachments A–G (Cardiac_Readability_IRB_Attachments.html). It records the editorial corrections applied to that document and the design decisions made. The two author-provided originals (the IRB application and the combined supporting-documents file) were left unchanged.</w:t>
       </w:r>
     </w:p>
     <w:p>
@@ -91,7 +91,7 @@
           <w:color w:val="1F4E79"/>
           <w:sz w:val="25"/>
         </w:rPr>
-        <w:t>Corrections applied to the standalone attachments</w:t>
+        <w:t>Corrections applied to the submission document</w:t>
       </w:r>
     </w:p>
     <w:tbl>
@@ -317,64 +317,6 @@
           </w:p>
         </w:tc>
       </w:tr>
-      <w:tr>
-        <w:tc>
-          <w:tcPr>
-            <w:tcW w:type="dxa" w:w="2736"/>
-            <w:vAlign w:val="center"/>
-          </w:tcPr>
-          <w:p>
-            <w:pPr>
-              <w:spacing w:before="40" w:after="40" w:line="252" w:lineRule="auto"/>
-            </w:pPr>
-            <w:r/>
-            <w:r>
-              <w:rPr>
-                <w:b/>
-                <w:color w:val="1F4E79"/>
-                <w:sz w:val="20"/>
-              </w:rPr>
-              <w:t>Attachment A — “Questions” section</w:t>
-            </w:r>
-          </w:p>
-        </w:tc>
-        <w:tc>
-          <w:tcPr>
-            <w:tcW w:type="dxa" w:w="3312"/>
-            <w:vAlign w:val="center"/>
-          </w:tcPr>
-          <w:p>
-            <w:pPr>
-              <w:spacing w:before="40" w:after="40" w:line="252" w:lineRule="auto"/>
-            </w:pPr>
-            <w:r/>
-            <w:r>
-              <w:rPr>
-                <w:sz w:val="20"/>
-              </w:rPr>
-              <w:t>Gave the principal investigator’s contact only.</w:t>
-            </w:r>
-          </w:p>
-        </w:tc>
-        <w:tc>
-          <w:tcPr>
-            <w:tcW w:type="dxa" w:w="3312"/>
-            <w:vAlign w:val="center"/>
-          </w:tcPr>
-          <w:p>
-            <w:pPr>
-              <w:spacing w:before="40" w:after="40" w:line="252" w:lineRule="auto"/>
-            </w:pPr>
-            <w:r/>
-            <w:r>
-              <w:rPr>
-                <w:sz w:val="20"/>
-              </w:rPr>
-              <w:t>Added a participant-rights line directing participants to the Mayo Clinic IRB (study number 26-008664), per section 6 of the proposal.</w:t>
-            </w:r>
-          </w:p>
-        </w:tc>
-      </w:tr>
     </w:tbl>
     <w:p>
       <w:pPr>
@@ -414,29 +356,13 @@
     </w:p>
     <w:p>
       <w:pPr>
-        <w:spacing w:before="240" w:after="100"/>
-        <w:keepNext w:val="true"/>
-        <w:keepLines w:val="true"/>
-        <w:pBdr>
-          <w:left w:val="single" w:sz="22" w:space="8" w:color="1F4E79"/>
-        </w:pBdr>
+        <w:pStyle w:val="ListBullet"/>
       </w:pPr>
       <w:r>
         <w:rPr>
-          <w:b/>
-          <w:color w:val="1F4E79"/>
-          <w:sz w:val="25"/>
+          <w:rFonts w:ascii="Calibri" w:hAnsi="Calibri"/>
         </w:rPr>
-        <w:t>Item still requiring the study team</w:t>
-      </w:r>
-    </w:p>
-    <w:p>
-      <w:pPr>
-        <w:pStyle w:val="ListBullet"/>
-        <w:spacing w:after="60" w:line="264" w:lineRule="auto"/>
-      </w:pPr>
-      <w:r>
-        <w:t>Insert the actual Mayo Clinic IRB telephone number and email where a placeholder appears in Attachment A (“Questions”) and Attachment C (closing screen). This is the only value that could not be supplied here.</w:t>
+        <w:t>Participant-facing contact is the principal investigator only. At the study team’s direction, the information sheet (Attachment A) and the survey closing screen (Attachment C) direct participants to Dr. Muhammad Naeem at naeem.muhammad@mayo.edu; no separate board contact line is included.</w:t>
       </w:r>
     </w:p>
     <w:sectPr>

</xml_diff>